<commit_message>
Handover updated for the model transition; perform-research skill delegated as card S.1
handover_2026-08-27.md now covers the full day: sections 7-9 add the evening
(assessment, discussion amendments, the committed numbers), the model-handover
protocol -- entry sequence, standing rules, six escalation triggers, scheduled
review gates after A.2/A.3/B.4 -- and the next session's first tasks. Jonas
will hand the full chat transcript to the next (cheaper) session; the
repository stays authoritative where they differ.

Card S.1 added to docs/czb_work_orders.md: the next session drafts the
perform-research skill (reproducibility, verification, documentation,
between-model handover protocol, statistical practice), researching existing
online practice with attribution, draft for Jonas's review only.

Co-Authored-By: Claude Fable 5 <noreply@anthropic.com>
</commit_message>
<xml_diff>
--- a/docs/czb_work_orders.docx
+++ b/docs/czb_work_orders.docx
@@ -2,7 +2,7 @@
 <file path=word/document.xml><?xml version="1.0" encoding="utf-8"?>
 <w:document xmlns:w="http://schemas.openxmlformats.org/wordprocessingml/2006/main" xmlns:m="http://schemas.openxmlformats.org/officeDocument/2006/math" xmlns:r="http://schemas.openxmlformats.org/officeDocument/2006/relationships" xmlns:o="urn:schemas-microsoft-com:office:office" xmlns:v="urn:schemas-microsoft-com:vml" xmlns:w10="urn:schemas-microsoft-com:office:word" xmlns:a="http://schemas.openxmlformats.org/drawingml/2006/main" xmlns:pic="http://schemas.openxmlformats.org/drawingml/2006/picture" xmlns:wp="http://schemas.openxmlformats.org/drawingml/2006/wordprocessingDrawing">
   <w:body>
-    <w:bookmarkStart w:id="22" w:name="X0c60649bbad77bc2cf89756300a6f1ed98d3eeb"/>
+    <w:bookmarkStart w:id="23" w:name="X0c60649bbad77bc2cf89756300a6f1ed98d3eeb"/>
     <w:p>
       <w:pPr>
         <w:pStyle w:val="Heading1"/>
@@ -587,7 +587,7 @@
       </w:r>
     </w:p>
     <w:bookmarkEnd w:id="10"/>
-    <w:bookmarkStart w:id="20" w:name="task-cards"/>
+    <w:bookmarkStart w:id="21" w:name="task-cards"/>
     <w:p>
       <w:pPr>
         <w:pStyle w:val="Heading2"/>
@@ -596,13 +596,28 @@
         <w:t xml:space="preserve">3 Task cards</w:t>
       </w:r>
     </w:p>
-    <w:bookmarkStart w:id="11" w:name="card-a.1-synthetic-recovery-harness"/>
+    <w:bookmarkStart w:id="11" w:name="X5ce378f8024ce716a4e4df2bf955308520b097b"/>
     <w:p>
       <w:pPr>
         <w:pStyle w:val="Heading3"/>
       </w:pPr>
       <w:r>
-        <w:t xml:space="preserve">Card A.1 — synthetic-recovery harness</w:t>
+        <w:t xml:space="preserve">Card S.1 — draft the</w:t>
+      </w:r>
+      <w:r>
+        <w:t xml:space="preserve"> </w:t>
+      </w:r>
+      <w:r>
+        <w:rPr>
+          <w:rStyle w:val="VerbatimChar"/>
+        </w:rPr>
+        <w:t xml:space="preserve">perform-research</w:t>
+      </w:r>
+      <w:r>
+        <w:t xml:space="preserve"> </w:t>
+      </w:r>
+      <w:r>
+        <w:t xml:space="preserve">skill (first task for the next session)</w:t>
       </w:r>
     </w:p>
     <w:p>
@@ -621,13 +636,31 @@
         <w:t xml:space="preserve">Goal</w:t>
       </w:r>
       <w:r>
-        <w:t xml:space="preserve">: prove the stage-1 estimator recovers known parameters before touching</w:t>
-      </w:r>
-      <w:r>
-        <w:t xml:space="preserve"> </w:t>
-      </w:r>
-      <w:r>
-        <w:t xml:space="preserve">real data.</w:t>
+        <w:t xml:space="preserve">: a reusable, iteratively updatable skill that captures how research is</w:t>
+      </w:r>
+      <w:r>
+        <w:t xml:space="preserve"> </w:t>
+      </w:r>
+      <w:r>
+        <w:t xml:space="preserve">performed in this collaboration — so the working discipline survives model changes,</w:t>
+      </w:r>
+      <w:r>
+        <w:t xml:space="preserve"> </w:t>
+      </w:r>
+      <w:r>
+        <w:t xml:space="preserve">session changes, and time. Jonas asked for it explicitly, drafting delegated to the</w:t>
+      </w:r>
+      <w:r>
+        <w:t xml:space="preserve"> </w:t>
+      </w:r>
+      <w:r>
+        <w:t xml:space="preserve">next (cheaper) session, with the instruction to also look at what exists elsewhere</w:t>
+      </w:r>
+      <w:r>
+        <w:t xml:space="preserve"> </w:t>
+      </w:r>
+      <w:r>
+        <w:t xml:space="preserve">online and borrow with attribution.</w:t>
       </w:r>
     </w:p>
     <w:p>
@@ -646,7 +679,7 @@
         <w:t xml:space="preserve">Build</w:t>
       </w:r>
       <w:r>
-        <w:t xml:space="preserve">:</w:t>
+        <w:t xml:space="preserve">: draft</w:t>
       </w:r>
       <w:r>
         <w:t xml:space="preserve"> </w:t>
@@ -655,16 +688,118 @@
         <w:rPr>
           <w:rStyle w:val="VerbatimChar"/>
         </w:rPr>
-        <w:t xml:space="preserve">replication/czb/fit_recovery.py</w:t>
-      </w:r>
-      <w:r>
-        <w:t xml:space="preserve">. Simulate the Random cut-in design</w:t>
-      </w:r>
-      <w:r>
-        <w:t xml:space="preserve"> </w:t>
-      </w:r>
-      <w:r>
-        <w:t xml:space="preserve">(43 participants × 18 cells × 4 repetitions) from the generative model in</w:t>
+        <w:t xml:space="preserve">C:\Users\bargman\.claude\skills\perform-research\SKILL.md</w:t>
+      </w:r>
+      <w:r>
+        <w:t xml:space="preserve"> </w:t>
+      </w:r>
+      <w:r>
+        <w:t xml:space="preserve">with</w:t>
+      </w:r>
+      <w:r>
+        <w:t xml:space="preserve"> </w:t>
+      </w:r>
+      <w:r>
+        <w:t xml:space="preserve">frontmatter (name, description triggering on research execution, analysis tasks,</w:t>
+      </w:r>
+      <w:r>
+        <w:t xml:space="preserve"> </w:t>
+      </w:r>
+      <w:r>
+        <w:t xml:space="preserve">fitting runs, and model handovers in this project family). Required contents, from</w:t>
+      </w:r>
+      <w:r>
+        <w:t xml:space="preserve"> </w:t>
+      </w:r>
+      <w:r>
+        <w:t xml:space="preserve">this project’s accumulated practice:</w:t>
+      </w:r>
+    </w:p>
+    <w:p>
+      <w:pPr>
+        <w:pStyle w:val="Compact"/>
+        <w:numPr>
+          <w:ilvl w:val="1"/>
+          <w:numId w:val="1004"/>
+        </w:numPr>
+      </w:pPr>
+      <w:r>
+        <w:rPr>
+          <w:b/>
+          <w:bCs/>
+        </w:rPr>
+        <w:t xml:space="preserve">Reproducibility discipline</w:t>
+      </w:r>
+      <w:r>
+        <w:t xml:space="preserve">: every quoted number from a committed script with</w:t>
+      </w:r>
+      <w:r>
+        <w:t xml:space="preserve"> </w:t>
+      </w:r>
+      <w:r>
+        <w:t xml:space="preserve">tracked output; regeneration commands logged; generated artifacts never</w:t>
+      </w:r>
+      <w:r>
+        <w:t xml:space="preserve"> </w:t>
+      </w:r>
+      <w:r>
+        <w:t xml:space="preserve">hand-edited; the 2026-08-27 paired-difference correction as the cautionary tale.</w:t>
+      </w:r>
+    </w:p>
+    <w:p>
+      <w:pPr>
+        <w:pStyle w:val="Compact"/>
+        <w:numPr>
+          <w:ilvl w:val="1"/>
+          <w:numId w:val="1004"/>
+        </w:numPr>
+      </w:pPr>
+      <w:r>
+        <w:rPr>
+          <w:b/>
+          <w:bCs/>
+        </w:rPr>
+        <w:t xml:space="preserve">Verification discipline</w:t>
+      </w:r>
+      <w:r>
+        <w:t xml:space="preserve">: property tests before and after every task; verify</w:t>
+      </w:r>
+      <w:r>
+        <w:t xml:space="preserve"> </w:t>
+      </w:r>
+      <w:r>
+        <w:t xml:space="preserve">by two independent routes where feasible; results that contradict documented</w:t>
+      </w:r>
+      <w:r>
+        <w:t xml:space="preserve"> </w:t>
+      </w:r>
+      <w:r>
+        <w:t xml:space="preserve">findings get surfaced, never silently reconciled.</w:t>
+      </w:r>
+    </w:p>
+    <w:p>
+      <w:pPr>
+        <w:pStyle w:val="Compact"/>
+        <w:numPr>
+          <w:ilvl w:val="1"/>
+          <w:numId w:val="1004"/>
+        </w:numPr>
+      </w:pPr>
+      <w:r>
+        <w:rPr>
+          <w:b/>
+          <w:bCs/>
+        </w:rPr>
+        <w:t xml:space="preserve">Documentation discipline</w:t>
+      </w:r>
+      <w:r>
+        <w:t xml:space="preserve">: markdown as source of truth, Word/PDF generated;</w:t>
+      </w:r>
+      <w:r>
+        <w:t xml:space="preserve"> </w:t>
+      </w:r>
+      <w:r>
+        <w:t xml:space="preserve">dated handover files per arc plus a standing</w:t>
       </w:r>
       <w:r>
         <w:t xml:space="preserve"> </w:t>
@@ -673,19 +808,19 @@
         <w:rPr>
           <w:rStyle w:val="VerbatimChar"/>
         </w:rPr>
-        <w:t xml:space="preserve">docs/czb_fitting_plan.md</w:t>
-      </w:r>
-      <w:r>
-        <w:t xml:space="preserve"> </w:t>
-      </w:r>
-      <w:r>
-        <w:t xml:space="preserve">§2 stage 1: c_i ~ LogNormal(μ, σ), lapse floor b</w:t>
-      </w:r>
-      <w:r>
-        <w:t xml:space="preserve"> </w:t>
-      </w:r>
-      <w:r>
-        <w:t xml:space="preserve">(both variants), P = b + (1−b)·Φ((x − c_i)/σ_resp) with x = the cell’s</w:t>
+        <w:t xml:space="preserve">handover.md</w:t>
+      </w:r>
+      <w:r>
+        <w:t xml:space="preserve"> </w:t>
+      </w:r>
+      <w:r>
+        <w:t xml:space="preserve">entry point; decisions</w:t>
+      </w:r>
+      <w:r>
+        <w:t xml:space="preserve"> </w:t>
+      </w:r>
+      <w:r>
+        <w:t xml:space="preserve">recorded with their reasoning and their location; the</w:t>
       </w:r>
       <w:r>
         <w:t xml:space="preserve"> </w:t>
@@ -694,13 +829,44 @@
         <w:rPr>
           <w:rStyle w:val="VerbatimChar"/>
         </w:rPr>
-        <w:t xml:space="preserve">deficit_max</w:t>
-      </w:r>
-      <w:r>
-        <w:t xml:space="preserve"> </w:t>
-      </w:r>
-      <w:r>
-        <w:t xml:space="preserve">from</w:t>
+        <w:t xml:space="preserve">jonas-academic-writing</w:t>
+      </w:r>
+      <w:r>
+        <w:t xml:space="preserve"> </w:t>
+      </w:r>
+      <w:r>
+        <w:t xml:space="preserve">conventions for anything addressed to Jonas.</w:t>
+      </w:r>
+    </w:p>
+    <w:p>
+      <w:pPr>
+        <w:pStyle w:val="Compact"/>
+        <w:numPr>
+          <w:ilvl w:val="1"/>
+          <w:numId w:val="1004"/>
+        </w:numPr>
+      </w:pPr>
+      <w:r>
+        <w:rPr>
+          <w:b/>
+          <w:bCs/>
+        </w:rPr>
+        <w:t xml:space="preserve">Between-model handover protocol</w:t>
+      </w:r>
+      <w:r>
+        <w:t xml:space="preserve">: the entry sequence (handover chain →</w:t>
+      </w:r>
+      <w:r>
+        <w:t xml:space="preserve"> </w:t>
+      </w:r>
+      <w:r>
+        <w:t xml:space="preserve">roadmap → work orders), one card per session, the escalation triggers and review</w:t>
+      </w:r>
+      <w:r>
+        <w:t xml:space="preserve"> </w:t>
+      </w:r>
+      <w:r>
+        <w:t xml:space="preserve">gates (copy from</w:t>
       </w:r>
       <w:r>
         <w:t xml:space="preserve"> </w:t>
@@ -709,34 +875,62 @@
         <w:rPr>
           <w:rStyle w:val="VerbatimChar"/>
         </w:rPr>
-        <w:t xml:space="preserve">comfortzone.czb_data.random_cutin_trials()</w:t>
-      </w:r>
-      <w:r>
-        <w:t xml:space="preserve">. Fit by MAP in</w:t>
-      </w:r>
-      <w:r>
-        <w:t xml:space="preserve"> </w:t>
-      </w:r>
-      <w:r>
-        <w:t xml:space="preserve">torch (L-BFGS) with Laplace SEs; also fit the a_allowed parameterization (threshold</w:t>
-      </w:r>
-      <w:r>
-        <w:t xml:space="preserve"> </w:t>
-      </w:r>
-      <w:r>
-        <w:t xml:space="preserve">on</w:t>
-      </w:r>
-      <w:r>
-        <w:t xml:space="preserve"> </w:t>
-      </w:r>
-      <w:r>
-        <w:rPr>
-          <w:rStyle w:val="VerbatimChar"/>
-        </w:rPr>
-        <w:t xml:space="preserve">a_req_max</w:t>
-      </w:r>
-      <w:r>
-        <w:t xml:space="preserve">).</w:t>
+        <w:t xml:space="preserve">handover_2026-08-27.md</w:t>
+      </w:r>
+      <w:r>
+        <w:t xml:space="preserve"> </w:t>
+      </w:r>
+      <w:r>
+        <w:t xml:space="preserve">§8 — that list is the current</w:t>
+      </w:r>
+      <w:r>
+        <w:t xml:space="preserve"> </w:t>
+      </w:r>
+      <w:r>
+        <w:t xml:space="preserve">authority), worklog appends, and the rule that a cheaper session executes cards</w:t>
+      </w:r>
+      <w:r>
+        <w:t xml:space="preserve"> </w:t>
+      </w:r>
+      <w:r>
+        <w:t xml:space="preserve">and never improvises around a failed acceptance criterion.</w:t>
+      </w:r>
+    </w:p>
+    <w:p>
+      <w:pPr>
+        <w:pStyle w:val="Compact"/>
+        <w:numPr>
+          <w:ilvl w:val="1"/>
+          <w:numId w:val="1004"/>
+        </w:numPr>
+      </w:pPr>
+      <w:r>
+        <w:rPr>
+          <w:b/>
+          <w:bCs/>
+        </w:rPr>
+        <w:t xml:space="preserve">Statistical practice</w:t>
+      </w:r>
+      <w:r>
+        <w:t xml:space="preserve">: uncertainty conventions stated and resampled</w:t>
+      </w:r>
+      <w:r>
+        <w:t xml:space="preserve"> </w:t>
+      </w:r>
+      <w:r>
+        <w:t xml:space="preserve">completely (all variance sources); comparisons as differences; held-out</w:t>
+      </w:r>
+      <w:r>
+        <w:t xml:space="preserve"> </w:t>
+      </w:r>
+      <w:r>
+        <w:t xml:space="preserve">validation for any model comparison; pre-stated decision rules for verdict</w:t>
+      </w:r>
+      <w:r>
+        <w:t xml:space="preserve"> </w:t>
+      </w:r>
+      <w:r>
+        <w:t xml:space="preserve">experiments.</w:t>
       </w:r>
     </w:p>
     <w:p>
@@ -752,22 +946,34 @@
           <w:b/>
           <w:bCs/>
         </w:rPr>
-        <w:t xml:space="preserve">Accept</w:t>
-      </w:r>
-      <w:r>
-        <w:t xml:space="preserve">: over 20 simulated datasets, population μ and σ recovered within 2</w:t>
-      </w:r>
-      <w:r>
-        <w:t xml:space="preserve"> </w:t>
-      </w:r>
-      <w:r>
-        <w:t xml:space="preserve">Laplace SEs in ≥ 18; per-driver c_i shrinkage visible (posterior means closer to</w:t>
-      </w:r>
-      <w:r>
-        <w:t xml:space="preserve"> </w:t>
-      </w:r>
-      <w:r>
-        <w:t xml:space="preserve">truth than raw per-driver MLEs in RMSE). Runtime under 10 minutes total.</w:t>
+        <w:t xml:space="preserve">Research step</w:t>
+      </w:r>
+      <w:r>
+        <w:t xml:space="preserve">: search online for existing practice worth borrowing — multi-</w:t>
+      </w:r>
+      <w:r>
+        <w:t xml:space="preserve"> </w:t>
+      </w:r>
+      <w:r>
+        <w:t xml:space="preserve">agent / multi-model handoff patterns, LLM-assisted research workflow guides,</w:t>
+      </w:r>
+      <w:r>
+        <w:t xml:space="preserve"> </w:t>
+      </w:r>
+      <w:r>
+        <w:t xml:space="preserve">lab-notebook and reproducibility standards (e.g. from open-science communities),</w:t>
+      </w:r>
+      <w:r>
+        <w:t xml:space="preserve"> </w:t>
+      </w:r>
+      <w:r>
+        <w:t xml:space="preserve">and any published skill/prompt libraries for research execution. Cite what is</w:t>
+      </w:r>
+      <w:r>
+        <w:t xml:space="preserve"> </w:t>
+      </w:r>
+      <w:r>
+        <w:t xml:space="preserve">borrowed; mark unverified claims per house rules.</w:t>
       </w:r>
     </w:p>
     <w:p>
@@ -783,22 +989,55 @@
           <w:b/>
           <w:bCs/>
         </w:rPr>
-        <w:t xml:space="preserve">Pitfalls</w:t>
-      </w:r>
-      <w:r>
-        <w:t xml:space="preserve">: identifiability of (c, σ_resp) scale — fix σ_resp’s prior scale from</w:t>
-      </w:r>
-      <w:r>
-        <w:t xml:space="preserve"> </w:t>
-      </w:r>
-      <w:r>
-        <w:t xml:space="preserve">the pilot (≈ 2 200 deficit units); lapse and threshold trade off at C1 — check the</w:t>
-      </w:r>
-      <w:r>
-        <w:t xml:space="preserve"> </w:t>
-      </w:r>
-      <w:r>
-        <w:t xml:space="preserve">recovery specifically at b.</w:t>
+        <w:t xml:space="preserve">Accept</w:t>
+      </w:r>
+      <w:r>
+        <w:t xml:space="preserve">: the draft SKILL.md exists, is under ~300 lines, cites its sources, and</w:t>
+      </w:r>
+      <w:r>
+        <w:t xml:space="preserve"> </w:t>
+      </w:r>
+      <w:r>
+        <w:t xml:space="preserve">ends with an explicit</w:t>
+      </w:r>
+      <w:r>
+        <w:t xml:space="preserve"> </w:t>
+      </w:r>
+      <w:r>
+        <w:t xml:space="preserve">“for Jonas’s review”</w:t>
+      </w:r>
+      <w:r>
+        <w:t xml:space="preserve"> </w:t>
+      </w:r>
+      <w:r>
+        <w:t xml:space="preserve">note.</w:t>
+      </w:r>
+      <w:r>
+        <w:t xml:space="preserve"> </w:t>
+      </w:r>
+      <w:r>
+        <w:rPr>
+          <w:b/>
+          <w:bCs/>
+        </w:rPr>
+        <w:t xml:space="preserve">Do not treat the skill as active</w:t>
+      </w:r>
+      <w:r>
+        <w:rPr>
+          <w:b/>
+          <w:bCs/>
+        </w:rPr>
+        <w:t xml:space="preserve"> </w:t>
+      </w:r>
+      <w:r>
+        <w:rPr>
+          <w:b/>
+          <w:bCs/>
+        </w:rPr>
+        <w:t xml:space="preserve">until Jonas approves it</w:t>
+      </w:r>
+      <w:r>
+        <w:t xml:space="preserve">; iterate on his comments in later sessions.</w:t>
       </w:r>
     </w:p>
     <w:p>
@@ -817,224 +1056,23 @@
         <w:t xml:space="preserve">Stop if</w:t>
       </w:r>
       <w:r>
-        <w:t xml:space="preserve">: recovery fails after two honest attempts — report the failure mode,</w:t>
-      </w:r>
-      <w:r>
-        <w:t xml:space="preserve"> </w:t>
-      </w:r>
-      <w:r>
-        <w:t xml:space="preserve">do not loosen the acceptance criterion.</w:t>
+        <w:t xml:space="preserve">: unsure whether some practice is project law or one session’s habit —</w:t>
+      </w:r>
+      <w:r>
+        <w:t xml:space="preserve"> </w:t>
+      </w:r>
+      <w:r>
+        <w:t xml:space="preserve">list the uncertain items in the draft for Jonas to rule on rather than guessing.</w:t>
       </w:r>
     </w:p>
     <w:bookmarkEnd w:id="11"/>
-    <w:bookmarkStart w:id="12" w:name="X7012458fadcc0d15dc90995d0510793cebc8b3f"/>
+    <w:bookmarkStart w:id="12" w:name="card-a.1-synthetic-recovery-harness"/>
     <w:p>
       <w:pPr>
         <w:pStyle w:val="Heading3"/>
       </w:pPr>
       <w:r>
-        <w:t xml:space="preserve">Card A.2 — stage-1 hierarchical fit, both bias variants</w:t>
-      </w:r>
-    </w:p>
-    <w:p>
-      <w:pPr>
-        <w:pStyle w:val="Compact"/>
-        <w:numPr>
-          <w:ilvl w:val="0"/>
-          <w:numId w:val="1004"/>
-        </w:numPr>
-      </w:pPr>
-      <w:r>
-        <w:rPr>
-          <w:b/>
-          <w:bCs/>
-        </w:rPr>
-        <w:t xml:space="preserve">Goal</w:t>
-      </w:r>
-      <w:r>
-        <w:t xml:space="preserve">: the population distribution of the boundary level, and the bias-model</w:t>
-      </w:r>
-      <w:r>
-        <w:t xml:space="preserve"> </w:t>
-      </w:r>
-      <w:r>
-        <w:t xml:space="preserve">decision.</w:t>
-      </w:r>
-    </w:p>
-    <w:p>
-      <w:pPr>
-        <w:pStyle w:val="Compact"/>
-        <w:numPr>
-          <w:ilvl w:val="0"/>
-          <w:numId w:val="1004"/>
-        </w:numPr>
-      </w:pPr>
-      <w:r>
-        <w:rPr>
-          <w:b/>
-          <w:bCs/>
-        </w:rPr>
-        <w:t xml:space="preserve">Build</w:t>
-      </w:r>
-      <w:r>
-        <w:t xml:space="preserve">:</w:t>
-      </w:r>
-      <w:r>
-        <w:t xml:space="preserve"> </w:t>
-      </w:r>
-      <w:r>
-        <w:rPr>
-          <w:rStyle w:val="VerbatimChar"/>
-        </w:rPr>
-        <w:t xml:space="preserve">replication/czb/fit_stage1.py</w:t>
-      </w:r>
-      <w:r>
-        <w:t xml:space="preserve">, reusing A.1’s model code on the real</w:t>
-      </w:r>
-      <w:r>
-        <w:t xml:space="preserve"> </w:t>
-      </w:r>
-      <w:r>
-        <w:t xml:space="preserve">trials. Fit all four combinations: {deficit axis, a_req axis} × {group-level b,</w:t>
-      </w:r>
-      <w:r>
-        <w:t xml:space="preserve"> </w:t>
-      </w:r>
-      <w:r>
-        <w:t xml:space="preserve">hierarchical b_i}. The ordered braking-expectation response enters as two nested</w:t>
-      </w:r>
-      <w:r>
-        <w:t xml:space="preserve"> </w:t>
-      </w:r>
-      <w:r>
-        <w:t xml:space="preserve">thresholds (fitting plan §2); both levels free per roadmap §0b.</w:t>
-      </w:r>
-    </w:p>
-    <w:p>
-      <w:pPr>
-        <w:pStyle w:val="Compact"/>
-        <w:numPr>
-          <w:ilvl w:val="0"/>
-          <w:numId w:val="1004"/>
-        </w:numPr>
-      </w:pPr>
-      <w:r>
-        <w:rPr>
-          <w:b/>
-          <w:bCs/>
-        </w:rPr>
-        <w:t xml:space="preserve">Report</w:t>
-      </w:r>
-      <w:r>
-        <w:t xml:space="preserve"> </w:t>
-      </w:r>
-      <w:r>
-        <w:t xml:space="preserve">(</w:t>
-      </w:r>
-      <w:r>
-        <w:rPr>
-          <w:rStyle w:val="VerbatimChar"/>
-        </w:rPr>
-        <w:t xml:space="preserve">replication/czb/out/stage1_summary.md</w:t>
-      </w:r>
-      <w:r>
-        <w:t xml:space="preserve">): population μ, σ with SEs;</w:t>
-      </w:r>
-      <w:r>
-        <w:t xml:space="preserve"> </w:t>
-      </w:r>
-      <w:r>
-        <w:t xml:space="preserve">percentile table (50–95 in steps of 5) of the population distribution with CIs;</w:t>
-      </w:r>
-      <w:r>
-        <w:t xml:space="preserve"> </w:t>
-      </w:r>
-      <w:r>
-        <w:t xml:space="preserve">held-out log-likelihood (leave-one-participant-out, 43 folds); posterior predictive</w:t>
-      </w:r>
-      <w:r>
-        <w:t xml:space="preserve"> </w:t>
-      </w:r>
-      <w:r>
-        <w:t xml:space="preserve">P(intervene) per C1 cell against observed; fitted comfort and dread levels</w:t>
-      </w:r>
-      <w:r>
-        <w:t xml:space="preserve"> </w:t>
-      </w:r>
-      <w:r>
-        <w:t xml:space="preserve">translated to a_allowed units and to steady-following THW at 20 m/s via</w:t>
-      </w:r>
-      <w:r>
-        <w:t xml:space="preserve"> </w:t>
-      </w:r>
-      <w:r>
-        <w:rPr>
-          <w:rStyle w:val="VerbatimChar"/>
-        </w:rPr>
-        <w:t xml:space="preserve">comfortzone.field.critical_thw</w:t>
-      </w:r>
-      <w:r>
-        <w:t xml:space="preserve">.</w:t>
-      </w:r>
-    </w:p>
-    <w:p>
-      <w:pPr>
-        <w:pStyle w:val="Compact"/>
-        <w:numPr>
-          <w:ilvl w:val="0"/>
-          <w:numId w:val="1004"/>
-        </w:numPr>
-      </w:pPr>
-      <w:r>
-        <w:rPr>
-          <w:b/>
-          <w:bCs/>
-        </w:rPr>
-        <w:t xml:space="preserve">Accept</w:t>
-      </w:r>
-      <w:r>
-        <w:t xml:space="preserve">: all four fits converge; the summary table renders; LOPO likelihood</w:t>
-      </w:r>
-      <w:r>
-        <w:t xml:space="preserve"> </w:t>
-      </w:r>
-      <w:r>
-        <w:t xml:space="preserve">distinguishes the bias variants or states that it cannot.</w:t>
-      </w:r>
-    </w:p>
-    <w:p>
-      <w:pPr>
-        <w:pStyle w:val="Compact"/>
-        <w:numPr>
-          <w:ilvl w:val="0"/>
-          <w:numId w:val="1004"/>
-        </w:numPr>
-      </w:pPr>
-      <w:r>
-        <w:rPr>
-          <w:b/>
-          <w:bCs/>
-        </w:rPr>
-        <w:t xml:space="preserve">Stop if</w:t>
-      </w:r>
-      <w:r>
-        <w:t xml:space="preserve">: the C1 cells misfit under both bias variants (systematic sign pattern</w:t>
-      </w:r>
-      <w:r>
-        <w:t xml:space="preserve"> </w:t>
-      </w:r>
-      <w:r>
-        <w:t xml:space="preserve">across criticalities) — that is the anticipation-leak question and needs review.</w:t>
-      </w:r>
-    </w:p>
-    <w:bookmarkEnd w:id="12"/>
-    <w:bookmarkStart w:id="13" w:name="Xbeb80fc684e59d248c2830b01171a26507f84a9"/>
-    <w:p>
-      <w:pPr>
-        <w:pStyle w:val="Heading3"/>
-      </w:pPr>
-      <w:r>
-        <w:t xml:space="preserve">Card A.3 — the accumulator layer (review gate on its verdict)</w:t>
+        <w:t xml:space="preserve">Card A.1 — synthetic-recovery harness</w:t>
       </w:r>
     </w:p>
     <w:p>
@@ -1053,13 +1091,13 @@
         <w:t xml:space="preserve">Goal</w:t>
       </w:r>
       <w:r>
-        <w:t xml:space="preserve">: the pre-registered test: does time-integration close the within-scenario</w:t>
-      </w:r>
-      <w:r>
-        <w:t xml:space="preserve"> </w:t>
-      </w:r>
-      <w:r>
-        <w:t xml:space="preserve">gap?</w:t>
+        <w:t xml:space="preserve">: prove the stage-1 estimator recovers known parameters before touching</w:t>
+      </w:r>
+      <w:r>
+        <w:t xml:space="preserve"> </w:t>
+      </w:r>
+      <w:r>
+        <w:t xml:space="preserve">real data.</w:t>
       </w:r>
     </w:p>
     <w:p>
@@ -1087,16 +1125,16 @@
         <w:rPr>
           <w:rStyle w:val="VerbatimChar"/>
         </w:rPr>
-        <w:t xml:space="preserve">replication/czb/fit_stage2.py</w:t>
-      </w:r>
-      <w:r>
-        <w:t xml:space="preserve">. Evidence = the per-frame deficit series</w:t>
-      </w:r>
-      <w:r>
-        <w:t xml:space="preserve"> </w:t>
-      </w:r>
-      <w:r>
-        <w:t xml:space="preserve">(not the running max) from</w:t>
+        <w:t xml:space="preserve">replication/czb/fit_recovery.py</w:t>
+      </w:r>
+      <w:r>
+        <w:t xml:space="preserve">. Simulate the Random cut-in design</w:t>
+      </w:r>
+      <w:r>
+        <w:t xml:space="preserve"> </w:t>
+      </w:r>
+      <w:r>
+        <w:t xml:space="preserve">(43 participants × 18 cells × 4 repetitions) from the generative model in</w:t>
       </w:r>
       <w:r>
         <w:t xml:space="preserve"> </w:t>
@@ -1105,34 +1143,70 @@
         <w:rPr>
           <w:rStyle w:val="VerbatimChar"/>
         </w:rPr>
-        <w:t xml:space="preserve">stimulus_field</w:t>
-      </w:r>
-      <w:r>
-        <w:t xml:space="preserve">; linear accumulator with gain and</w:t>
-      </w:r>
-      <w:r>
-        <w:t xml:space="preserve"> </w:t>
-      </w:r>
-      <w:r>
-        <w:t xml:space="preserve">noise, threshold from A.2’s c_i; P(crossed by clip end) per trial via the</w:t>
-      </w:r>
-      <w:r>
-        <w:t xml:space="preserve"> </w:t>
-      </w:r>
-      <w:r>
-        <w:t xml:space="preserve">closed-form Gaussian first-passage approximation or 200-path simulation per cell</w:t>
-      </w:r>
-      <w:r>
-        <w:t xml:space="preserve"> </w:t>
-      </w:r>
-      <w:r>
-        <w:t xml:space="preserve">(cells share stimuli, so simulate per cell, not per trial). Motor latency fixed at</w:t>
-      </w:r>
-      <w:r>
-        <w:t xml:space="preserve"> </w:t>
-      </w:r>
-      <w:r>
-        <w:t xml:space="preserve">0.25 s; sensitivity refits at 0.15 and 0.35 s.</w:t>
+        <w:t xml:space="preserve">docs/czb_fitting_plan.md</w:t>
+      </w:r>
+      <w:r>
+        <w:t xml:space="preserve"> </w:t>
+      </w:r>
+      <w:r>
+        <w:t xml:space="preserve">§2 stage 1: c_i ~ LogNormal(μ, σ), lapse floor b</w:t>
+      </w:r>
+      <w:r>
+        <w:t xml:space="preserve"> </w:t>
+      </w:r>
+      <w:r>
+        <w:t xml:space="preserve">(both variants), P = b + (1−b)·Φ((x − c_i)/σ_resp) with x = the cell’s</w:t>
+      </w:r>
+      <w:r>
+        <w:t xml:space="preserve"> </w:t>
+      </w:r>
+      <w:r>
+        <w:rPr>
+          <w:rStyle w:val="VerbatimChar"/>
+        </w:rPr>
+        <w:t xml:space="preserve">deficit_max</w:t>
+      </w:r>
+      <w:r>
+        <w:t xml:space="preserve"> </w:t>
+      </w:r>
+      <w:r>
+        <w:t xml:space="preserve">from</w:t>
+      </w:r>
+      <w:r>
+        <w:t xml:space="preserve"> </w:t>
+      </w:r>
+      <w:r>
+        <w:rPr>
+          <w:rStyle w:val="VerbatimChar"/>
+        </w:rPr>
+        <w:t xml:space="preserve">comfortzone.czb_data.random_cutin_trials()</w:t>
+      </w:r>
+      <w:r>
+        <w:t xml:space="preserve">. Fit by MAP in</w:t>
+      </w:r>
+      <w:r>
+        <w:t xml:space="preserve"> </w:t>
+      </w:r>
+      <w:r>
+        <w:t xml:space="preserve">torch (L-BFGS) with Laplace SEs; also fit the a_allowed parameterization (threshold</w:t>
+      </w:r>
+      <w:r>
+        <w:t xml:space="preserve"> </w:t>
+      </w:r>
+      <w:r>
+        <w:t xml:space="preserve">on</w:t>
+      </w:r>
+      <w:r>
+        <w:t xml:space="preserve"> </w:t>
+      </w:r>
+      <w:r>
+        <w:rPr>
+          <w:rStyle w:val="VerbatimChar"/>
+        </w:rPr>
+        <w:t xml:space="preserve">a_req_max</w:t>
+      </w:r>
+      <w:r>
+        <w:t xml:space="preserve">).</w:t>
       </w:r>
     </w:p>
     <w:p>
@@ -1148,28 +1222,22 @@
           <w:b/>
           <w:bCs/>
         </w:rPr>
-        <w:t xml:space="preserve">Accept / decision rule (pre-stated)</w:t>
-      </w:r>
-      <w:r>
-        <w:t xml:space="preserve">: held-out (leave-one-criticality-out) RMSE</w:t>
-      </w:r>
-      <w:r>
-        <w:t xml:space="preserve"> </w:t>
-      </w:r>
-      <w:r>
-        <w:t xml:space="preserve">on the 18-cell surface ≤ 0.11 counts as closing the gap (the 2D state rule’s 0.120</w:t>
-      </w:r>
-      <w:r>
-        <w:t xml:space="preserve"> </w:t>
-      </w:r>
-      <w:r>
-        <w:t xml:space="preserve">and the design ceiling’s ~0.10 bracket the target); &gt; 0.13 counts as failure and</w:t>
-      </w:r>
-      <w:r>
-        <w:t xml:space="preserve"> </w:t>
-      </w:r>
-      <w:r>
-        <w:t xml:space="preserve">is reported as evidence against the framework per the assessment.</w:t>
+        <w:t xml:space="preserve">Accept</w:t>
+      </w:r>
+      <w:r>
+        <w:t xml:space="preserve">: over 20 simulated datasets, population μ and σ recovered within 2</w:t>
+      </w:r>
+      <w:r>
+        <w:t xml:space="preserve"> </w:t>
+      </w:r>
+      <w:r>
+        <w:t xml:space="preserve">Laplace SEs in ≥ 18; per-driver c_i shrinkage visible (posterior means closer to</w:t>
+      </w:r>
+      <w:r>
+        <w:t xml:space="preserve"> </w:t>
+      </w:r>
+      <w:r>
+        <w:t xml:space="preserve">truth than raw per-driver MLEs in RMSE). Runtime under 10 minutes total.</w:t>
       </w:r>
     </w:p>
     <w:p>
@@ -1185,26 +1253,57 @@
           <w:b/>
           <w:bCs/>
         </w:rPr>
+        <w:t xml:space="preserve">Pitfalls</w:t>
+      </w:r>
+      <w:r>
+        <w:t xml:space="preserve">: identifiability of (c, σ_resp) scale — fix σ_resp’s prior scale from</w:t>
+      </w:r>
+      <w:r>
+        <w:t xml:space="preserve"> </w:t>
+      </w:r>
+      <w:r>
+        <w:t xml:space="preserve">the pilot (≈ 2 200 deficit units); lapse and threshold trade off at C1 — check the</w:t>
+      </w:r>
+      <w:r>
+        <w:t xml:space="preserve"> </w:t>
+      </w:r>
+      <w:r>
+        <w:t xml:space="preserve">recovery specifically at b.</w:t>
+      </w:r>
+    </w:p>
+    <w:p>
+      <w:pPr>
+        <w:pStyle w:val="Compact"/>
+        <w:numPr>
+          <w:ilvl w:val="0"/>
+          <w:numId w:val="1005"/>
+        </w:numPr>
+      </w:pPr>
+      <w:r>
+        <w:rPr>
+          <w:b/>
+          <w:bCs/>
+        </w:rPr>
         <w:t xml:space="preserve">Stop if</w:t>
       </w:r>
       <w:r>
-        <w:t xml:space="preserve">: the fitted gain wants to be so large the accumulator degenerates to</w:t>
-      </w:r>
-      <w:r>
-        <w:t xml:space="preserve"> </w:t>
-      </w:r>
-      <w:r>
-        <w:t xml:space="preserve">the static threshold — report, since that itself answers the question.</w:t>
-      </w:r>
-    </w:p>
-    <w:bookmarkEnd w:id="13"/>
-    <w:bookmarkStart w:id="14" w:name="card-a.4-button-side-validation"/>
+        <w:t xml:space="preserve">: recovery fails after two honest attempts — report the failure mode,</w:t>
+      </w:r>
+      <w:r>
+        <w:t xml:space="preserve"> </w:t>
+      </w:r>
+      <w:r>
+        <w:t xml:space="preserve">do not loosen the acceptance criterion.</w:t>
+      </w:r>
+    </w:p>
+    <w:bookmarkEnd w:id="12"/>
+    <w:bookmarkStart w:id="13" w:name="X7012458fadcc0d15dc90995d0510793cebc8b3f"/>
     <w:p>
       <w:pPr>
         <w:pStyle w:val="Heading3"/>
       </w:pPr>
       <w:r>
-        <w:t xml:space="preserve">Card A.4 — button-side validation</w:t>
+        <w:t xml:space="preserve">Card A.2 — stage-1 hierarchical fit, both bias variants</w:t>
       </w:r>
     </w:p>
     <w:p>
@@ -1223,13 +1322,13 @@
         <w:t xml:space="preserve">Goal</w:t>
       </w:r>
       <w:r>
-        <w:t xml:space="preserve">: predict the press-time densities from the Random-fitted model with one</w:t>
-      </w:r>
-      <w:r>
-        <w:t xml:space="preserve"> </w:t>
-      </w:r>
-      <w:r>
-        <w:t xml:space="preserve">paradigm shift.</w:t>
+        <w:t xml:space="preserve">: the population distribution of the boundary level, and the bias-model</w:t>
+      </w:r>
+      <w:r>
+        <w:t xml:space="preserve"> </w:t>
+      </w:r>
+      <w:r>
+        <w:t xml:space="preserve">decision.</w:t>
       </w:r>
     </w:p>
     <w:p>
@@ -1257,49 +1356,28 @@
         <w:rPr>
           <w:rStyle w:val="VerbatimChar"/>
         </w:rPr>
-        <w:t xml:space="preserve">replication/czb/validate_button.py</w:t>
-      </w:r>
-      <w:r>
-        <w:t xml:space="preserve"> </w:t>
-      </w:r>
-      <w:r>
-        <w:t xml:space="preserve">on</w:t>
-      </w:r>
-      <w:r>
-        <w:t xml:space="preserve"> </w:t>
-      </w:r>
-      <w:r>
-        <w:rPr>
-          <w:rStyle w:val="VerbatimChar"/>
-        </w:rPr>
-        <w:t xml:space="preserve">czb_data.button_cutin_trials()</w:t>
-      </w:r>
-      <w:r>
-        <w:t xml:space="preserve">. Fit δ once as a threshold shift and once as a</w:t>
-      </w:r>
-      <w:r>
-        <w:t xml:space="preserve"> </w:t>
-      </w:r>
-      <w:r>
-        <w:t xml:space="preserve">gain shift; compare predicted vs observed press-time distributions per criticality</w:t>
-      </w:r>
-      <w:r>
-        <w:t xml:space="preserve"> </w:t>
-      </w:r>
-      <w:r>
-        <w:t xml:space="preserve">(QQ plots to</w:t>
-      </w:r>
-      <w:r>
-        <w:t xml:space="preserve"> </w:t>
-      </w:r>
-      <w:r>
-        <w:rPr>
-          <w:rStyle w:val="VerbatimChar"/>
-        </w:rPr>
-        <w:t xml:space="preserve">figures/</w:t>
-      </w:r>
-      <w:r>
-        <w:t xml:space="preserve">, one page) and report which shape fits.</w:t>
+        <w:t xml:space="preserve">replication/czb/fit_stage1.py</w:t>
+      </w:r>
+      <w:r>
+        <w:t xml:space="preserve">, reusing A.1’s model code on the real</w:t>
+      </w:r>
+      <w:r>
+        <w:t xml:space="preserve"> </w:t>
+      </w:r>
+      <w:r>
+        <w:t xml:space="preserve">trials. Fit all four combinations: {deficit axis, a_req axis} × {group-level b,</w:t>
+      </w:r>
+      <w:r>
+        <w:t xml:space="preserve"> </w:t>
+      </w:r>
+      <w:r>
+        <w:t xml:space="preserve">hierarchical b_i}. The ordered braking-expectation response enters as two nested</w:t>
+      </w:r>
+      <w:r>
+        <w:t xml:space="preserve"> </w:t>
+      </w:r>
+      <w:r>
+        <w:t xml:space="preserve">thresholds (fitting plan §2); both levels free per roadmap §0b.</w:t>
       </w:r>
     </w:p>
     <w:p>
@@ -1315,136 +1393,118 @@
           <w:b/>
           <w:bCs/>
         </w:rPr>
+        <w:t xml:space="preserve">Report</w:t>
+      </w:r>
+      <w:r>
+        <w:t xml:space="preserve"> </w:t>
+      </w:r>
+      <w:r>
+        <w:t xml:space="preserve">(</w:t>
+      </w:r>
+      <w:r>
+        <w:rPr>
+          <w:rStyle w:val="VerbatimChar"/>
+        </w:rPr>
+        <w:t xml:space="preserve">replication/czb/out/stage1_summary.md</w:t>
+      </w:r>
+      <w:r>
+        <w:t xml:space="preserve">): population μ, σ with SEs;</w:t>
+      </w:r>
+      <w:r>
+        <w:t xml:space="preserve"> </w:t>
+      </w:r>
+      <w:r>
+        <w:t xml:space="preserve">percentile table (50–95 in steps of 5) of the population distribution with CIs;</w:t>
+      </w:r>
+      <w:r>
+        <w:t xml:space="preserve"> </w:t>
+      </w:r>
+      <w:r>
+        <w:t xml:space="preserve">held-out log-likelihood (leave-one-participant-out, 43 folds); posterior predictive</w:t>
+      </w:r>
+      <w:r>
+        <w:t xml:space="preserve"> </w:t>
+      </w:r>
+      <w:r>
+        <w:t xml:space="preserve">P(intervene) per C1 cell against observed; fitted comfort and dread levels</w:t>
+      </w:r>
+      <w:r>
+        <w:t xml:space="preserve"> </w:t>
+      </w:r>
+      <w:r>
+        <w:t xml:space="preserve">translated to a_allowed units and to steady-following THW at 20 m/s via</w:t>
+      </w:r>
+      <w:r>
+        <w:t xml:space="preserve"> </w:t>
+      </w:r>
+      <w:r>
+        <w:rPr>
+          <w:rStyle w:val="VerbatimChar"/>
+        </w:rPr>
+        <w:t xml:space="preserve">comfortzone.field.critical_thw</w:t>
+      </w:r>
+      <w:r>
+        <w:t xml:space="preserve">.</w:t>
+      </w:r>
+    </w:p>
+    <w:p>
+      <w:pPr>
+        <w:pStyle w:val="Compact"/>
+        <w:numPr>
+          <w:ilvl w:val="0"/>
+          <w:numId w:val="1006"/>
+        </w:numPr>
+      </w:pPr>
+      <w:r>
+        <w:rPr>
+          <w:b/>
+          <w:bCs/>
+        </w:rPr>
         <w:t xml:space="preserve">Accept</w:t>
       </w:r>
       <w:r>
-        <w:t xml:space="preserve">: the documented cross-paradigm excess (+0.26 at TTC6) is reproduced by</w:t>
-      </w:r>
-      <w:r>
-        <w:t xml:space="preserve"> </w:t>
-      </w:r>
-      <w:r>
-        <w:t xml:space="preserve">the shifted model within 0.05 at the fixed-clip checkpoints.</w:t>
-      </w:r>
-    </w:p>
-    <w:bookmarkEnd w:id="14"/>
-    <w:bookmarkStart w:id="15" w:name="Xe9b12db9ccf940c2e98352feae798e2c271a525"/>
+        <w:t xml:space="preserve">: all four fits converge; the summary table renders; LOPO likelihood</w:t>
+      </w:r>
+      <w:r>
+        <w:t xml:space="preserve"> </w:t>
+      </w:r>
+      <w:r>
+        <w:t xml:space="preserve">distinguishes the bias variants or states that it cannot.</w:t>
+      </w:r>
+    </w:p>
+    <w:p>
+      <w:pPr>
+        <w:pStyle w:val="Compact"/>
+        <w:numPr>
+          <w:ilvl w:val="0"/>
+          <w:numId w:val="1006"/>
+        </w:numPr>
+      </w:pPr>
+      <w:r>
+        <w:rPr>
+          <w:b/>
+          <w:bCs/>
+        </w:rPr>
+        <w:t xml:space="preserve">Stop if</w:t>
+      </w:r>
+      <w:r>
+        <w:t xml:space="preserve">: the C1 cells misfit under both bias variants (systematic sign pattern</w:t>
+      </w:r>
+      <w:r>
+        <w:t xml:space="preserve"> </w:t>
+      </w:r>
+      <w:r>
+        <w:t xml:space="preserve">across criticalities) — that is the anticipation-leak question and needs review.</w:t>
+      </w:r>
+    </w:p>
+    <w:bookmarkEnd w:id="13"/>
+    <w:bookmarkStart w:id="14" w:name="Xbeb80fc684e59d248c2830b01171a26507f84a9"/>
     <w:p>
       <w:pPr>
         <w:pStyle w:val="Heading3"/>
       </w:pPr>
       <w:r>
-        <w:t xml:space="preserve">Cards B.1–B.3 — transfer-scenario field constructions</w:t>
-      </w:r>
-    </w:p>
-    <w:p>
-      <w:pPr>
-        <w:pStyle w:val="FirstParagraph"/>
-      </w:pPr>
-      <w:r>
-        <w:t xml:space="preserve">Template for each: a loader in</w:t>
-      </w:r>
-      <w:r>
-        <w:t xml:space="preserve"> </w:t>
-      </w:r>
-      <w:r>
-        <w:rPr>
-          <w:rStyle w:val="VerbatimChar"/>
-        </w:rPr>
-        <w:t xml:space="preserve">src/comfortzone/&lt;scenario&gt;.py</w:t>
-      </w:r>
-      <w:r>
-        <w:t xml:space="preserve"> </w:t>
-      </w:r>
-      <w:r>
-        <w:t xml:space="preserve">following</w:t>
-      </w:r>
-      <w:r>
-        <w:t xml:space="preserve"> </w:t>
-      </w:r>
-      <w:r>
-        <w:rPr>
-          <w:rStyle w:val="VerbatimChar"/>
-        </w:rPr>
-        <w:t xml:space="preserve">cutin.py</w:t>
-      </w:r>
-      <w:r>
-        <w:t xml:space="preserve">’s</w:t>
-      </w:r>
-      <w:r>
-        <w:t xml:space="preserve"> </w:t>
-      </w:r>
-      <w:r>
-        <w:t xml:space="preserve">structure (role assignment appropriate to the scenario —</w:t>
-      </w:r>
-      <w:r>
-        <w:t xml:space="preserve"> </w:t>
-      </w:r>
-      <w:r>
-        <w:rPr>
-          <w:b/>
-          <w:bCs/>
-        </w:rPr>
-        <w:t xml:space="preserve">by instructed vehicle, not</w:t>
-      </w:r>
-      <w:r>
-        <w:rPr>
-          <w:b/>
-          <w:bCs/>
-        </w:rPr>
-        <w:t xml:space="preserve"> </w:t>
-      </w:r>
-      <w:r>
-        <w:rPr>
-          <w:b/>
-          <w:bCs/>
-        </w:rPr>
-        <w:t xml:space="preserve">lateral span</w:t>
-      </w:r>
-      <w:r>
-        <w:t xml:space="preserve">), a field check script in</w:t>
-      </w:r>
-      <w:r>
-        <w:t xml:space="preserve"> </w:t>
-      </w:r>
-      <w:r>
-        <w:rPr>
-          <w:rStyle w:val="VerbatimChar"/>
-        </w:rPr>
-        <w:t xml:space="preserve">replication/czb/</w:t>
-      </w:r>
-      <w:r>
-        <w:t xml:space="preserve"> </w:t>
-      </w:r>
-      <w:r>
-        <w:t xml:space="preserve">producing a</w:t>
-      </w:r>
-      <w:r>
-        <w:t xml:space="preserve"> </w:t>
-      </w:r>
-      <w:r>
-        <w:t xml:space="preserve">per-criticality deficit figure, property tests, and the PS-versus-field correlation</w:t>
-      </w:r>
-      <w:r>
-        <w:t xml:space="preserve"> </w:t>
-      </w:r>
-      <w:r>
-        <w:t xml:space="preserve">(the</w:t>
-      </w:r>
-      <w:r>
-        <w:t xml:space="preserve"> </w:t>
-      </w:r>
-      <w:r>
-        <w:rPr>
-          <w:rStyle w:val="VerbatimChar"/>
-        </w:rPr>
-        <w:t xml:space="preserve">ps_vs_field.py</w:t>
-      </w:r>
-      <w:r>
-        <w:t xml:space="preserve"> </w:t>
-      </w:r>
-      <w:r>
-        <w:t xml:space="preserve">pattern) as the acceptance readout.</w:t>
+        <w:t xml:space="preserve">Card A.3 — the accumulator layer (review gate on its verdict)</w:t>
       </w:r>
     </w:p>
     <w:p>
@@ -1460,43 +1520,16 @@
           <w:b/>
           <w:bCs/>
         </w:rPr>
-        <w:t xml:space="preserve">B.1 cyclist overtake</w:t>
-      </w:r>
-      <w:r>
-        <w:t xml:space="preserve"> </w:t>
-      </w:r>
-      <w:r>
-        <w:t xml:space="preserve">(first): ego closes on a cyclist in lane; rear-end field</w:t>
-      </w:r>
-      <w:r>
-        <w:t xml:space="preserve"> </w:t>
-      </w:r>
-      <w:r>
-        <w:t xml:space="preserve">nearly unchanged; criticality = lateral clearance 0.5/1/1.5 m, so the lateral term</w:t>
-      </w:r>
-      <w:r>
-        <w:t xml:space="preserve"> </w:t>
-      </w:r>
-      <w:r>
-        <w:t xml:space="preserve">matters — use the actual clearance in</w:t>
-      </w:r>
-      <w:r>
-        <w:t xml:space="preserve"> </w:t>
-      </w:r>
-      <w:r>
-        <w:rPr>
-          <w:rStyle w:val="VerbatimChar"/>
-        </w:rPr>
-        <w:t xml:space="preserve">dy</w:t>
-      </w:r>
-      <w:r>
-        <w:t xml:space="preserve">, widths from the trace (cyclist ≈ 0.6 m).</w:t>
-      </w:r>
-      <w:r>
-        <w:t xml:space="preserve"> </w:t>
-      </w:r>
-      <w:r>
-        <w:t xml:space="preserve">Accept: deficit ordered by clearance at C2–C5; cell-level PS Spearman ρ reported.</w:t>
+        <w:t xml:space="preserve">Goal</w:t>
+      </w:r>
+      <w:r>
+        <w:t xml:space="preserve">: the pre-registered test: does time-integration close the within-scenario</w:t>
+      </w:r>
+      <w:r>
+        <w:t xml:space="preserve"> </w:t>
+      </w:r>
+      <w:r>
+        <w:t xml:space="preserve">gap?</w:t>
       </w:r>
     </w:p>
     <w:p>
@@ -1512,6 +1545,443 @@
           <w:b/>
           <w:bCs/>
         </w:rPr>
+        <w:t xml:space="preserve">Build</w:t>
+      </w:r>
+      <w:r>
+        <w:t xml:space="preserve">:</w:t>
+      </w:r>
+      <w:r>
+        <w:t xml:space="preserve"> </w:t>
+      </w:r>
+      <w:r>
+        <w:rPr>
+          <w:rStyle w:val="VerbatimChar"/>
+        </w:rPr>
+        <w:t xml:space="preserve">replication/czb/fit_stage2.py</w:t>
+      </w:r>
+      <w:r>
+        <w:t xml:space="preserve">. Evidence = the per-frame deficit series</w:t>
+      </w:r>
+      <w:r>
+        <w:t xml:space="preserve"> </w:t>
+      </w:r>
+      <w:r>
+        <w:t xml:space="preserve">(not the running max) from</w:t>
+      </w:r>
+      <w:r>
+        <w:t xml:space="preserve"> </w:t>
+      </w:r>
+      <w:r>
+        <w:rPr>
+          <w:rStyle w:val="VerbatimChar"/>
+        </w:rPr>
+        <w:t xml:space="preserve">stimulus_field</w:t>
+      </w:r>
+      <w:r>
+        <w:t xml:space="preserve">; linear accumulator with gain and</w:t>
+      </w:r>
+      <w:r>
+        <w:t xml:space="preserve"> </w:t>
+      </w:r>
+      <w:r>
+        <w:t xml:space="preserve">noise, threshold from A.2’s c_i; P(crossed by clip end) per trial via the</w:t>
+      </w:r>
+      <w:r>
+        <w:t xml:space="preserve"> </w:t>
+      </w:r>
+      <w:r>
+        <w:t xml:space="preserve">closed-form Gaussian first-passage approximation or 200-path simulation per cell</w:t>
+      </w:r>
+      <w:r>
+        <w:t xml:space="preserve"> </w:t>
+      </w:r>
+      <w:r>
+        <w:t xml:space="preserve">(cells share stimuli, so simulate per cell, not per trial). Motor latency fixed at</w:t>
+      </w:r>
+      <w:r>
+        <w:t xml:space="preserve"> </w:t>
+      </w:r>
+      <w:r>
+        <w:t xml:space="preserve">0.25 s; sensitivity refits at 0.15 and 0.35 s.</w:t>
+      </w:r>
+    </w:p>
+    <w:p>
+      <w:pPr>
+        <w:pStyle w:val="Compact"/>
+        <w:numPr>
+          <w:ilvl w:val="0"/>
+          <w:numId w:val="1007"/>
+        </w:numPr>
+      </w:pPr>
+      <w:r>
+        <w:rPr>
+          <w:b/>
+          <w:bCs/>
+        </w:rPr>
+        <w:t xml:space="preserve">Accept / decision rule (pre-stated)</w:t>
+      </w:r>
+      <w:r>
+        <w:t xml:space="preserve">: held-out (leave-one-criticality-out) RMSE</w:t>
+      </w:r>
+      <w:r>
+        <w:t xml:space="preserve"> </w:t>
+      </w:r>
+      <w:r>
+        <w:t xml:space="preserve">on the 18-cell surface ≤ 0.11 counts as closing the gap (the 2D state rule’s 0.120</w:t>
+      </w:r>
+      <w:r>
+        <w:t xml:space="preserve"> </w:t>
+      </w:r>
+      <w:r>
+        <w:t xml:space="preserve">and the design ceiling’s ~0.10 bracket the target); &gt; 0.13 counts as failure and</w:t>
+      </w:r>
+      <w:r>
+        <w:t xml:space="preserve"> </w:t>
+      </w:r>
+      <w:r>
+        <w:t xml:space="preserve">is reported as evidence against the framework per the assessment.</w:t>
+      </w:r>
+    </w:p>
+    <w:p>
+      <w:pPr>
+        <w:pStyle w:val="Compact"/>
+        <w:numPr>
+          <w:ilvl w:val="0"/>
+          <w:numId w:val="1007"/>
+        </w:numPr>
+      </w:pPr>
+      <w:r>
+        <w:rPr>
+          <w:b/>
+          <w:bCs/>
+        </w:rPr>
+        <w:t xml:space="preserve">Stop if</w:t>
+      </w:r>
+      <w:r>
+        <w:t xml:space="preserve">: the fitted gain wants to be so large the accumulator degenerates to</w:t>
+      </w:r>
+      <w:r>
+        <w:t xml:space="preserve"> </w:t>
+      </w:r>
+      <w:r>
+        <w:t xml:space="preserve">the static threshold — report, since that itself answers the question.</w:t>
+      </w:r>
+    </w:p>
+    <w:bookmarkEnd w:id="14"/>
+    <w:bookmarkStart w:id="15" w:name="card-a.4-button-side-validation"/>
+    <w:p>
+      <w:pPr>
+        <w:pStyle w:val="Heading3"/>
+      </w:pPr>
+      <w:r>
+        <w:t xml:space="preserve">Card A.4 — button-side validation</w:t>
+      </w:r>
+    </w:p>
+    <w:p>
+      <w:pPr>
+        <w:pStyle w:val="Compact"/>
+        <w:numPr>
+          <w:ilvl w:val="0"/>
+          <w:numId w:val="1008"/>
+        </w:numPr>
+      </w:pPr>
+      <w:r>
+        <w:rPr>
+          <w:b/>
+          <w:bCs/>
+        </w:rPr>
+        <w:t xml:space="preserve">Goal</w:t>
+      </w:r>
+      <w:r>
+        <w:t xml:space="preserve">: predict the press-time densities from the Random-fitted model with one</w:t>
+      </w:r>
+      <w:r>
+        <w:t xml:space="preserve"> </w:t>
+      </w:r>
+      <w:r>
+        <w:t xml:space="preserve">paradigm shift.</w:t>
+      </w:r>
+    </w:p>
+    <w:p>
+      <w:pPr>
+        <w:pStyle w:val="Compact"/>
+        <w:numPr>
+          <w:ilvl w:val="0"/>
+          <w:numId w:val="1008"/>
+        </w:numPr>
+      </w:pPr>
+      <w:r>
+        <w:rPr>
+          <w:b/>
+          <w:bCs/>
+        </w:rPr>
+        <w:t xml:space="preserve">Build</w:t>
+      </w:r>
+      <w:r>
+        <w:t xml:space="preserve">:</w:t>
+      </w:r>
+      <w:r>
+        <w:t xml:space="preserve"> </w:t>
+      </w:r>
+      <w:r>
+        <w:rPr>
+          <w:rStyle w:val="VerbatimChar"/>
+        </w:rPr>
+        <w:t xml:space="preserve">replication/czb/validate_button.py</w:t>
+      </w:r>
+      <w:r>
+        <w:t xml:space="preserve"> </w:t>
+      </w:r>
+      <w:r>
+        <w:t xml:space="preserve">on</w:t>
+      </w:r>
+      <w:r>
+        <w:t xml:space="preserve"> </w:t>
+      </w:r>
+      <w:r>
+        <w:rPr>
+          <w:rStyle w:val="VerbatimChar"/>
+        </w:rPr>
+        <w:t xml:space="preserve">czb_data.button_cutin_trials()</w:t>
+      </w:r>
+      <w:r>
+        <w:t xml:space="preserve">. Fit δ once as a threshold shift and once as a</w:t>
+      </w:r>
+      <w:r>
+        <w:t xml:space="preserve"> </w:t>
+      </w:r>
+      <w:r>
+        <w:t xml:space="preserve">gain shift; compare predicted vs observed press-time distributions per criticality</w:t>
+      </w:r>
+      <w:r>
+        <w:t xml:space="preserve"> </w:t>
+      </w:r>
+      <w:r>
+        <w:t xml:space="preserve">(QQ plots to</w:t>
+      </w:r>
+      <w:r>
+        <w:t xml:space="preserve"> </w:t>
+      </w:r>
+      <w:r>
+        <w:rPr>
+          <w:rStyle w:val="VerbatimChar"/>
+        </w:rPr>
+        <w:t xml:space="preserve">figures/</w:t>
+      </w:r>
+      <w:r>
+        <w:t xml:space="preserve">, one page) and report which shape fits.</w:t>
+      </w:r>
+    </w:p>
+    <w:p>
+      <w:pPr>
+        <w:pStyle w:val="Compact"/>
+        <w:numPr>
+          <w:ilvl w:val="0"/>
+          <w:numId w:val="1008"/>
+        </w:numPr>
+      </w:pPr>
+      <w:r>
+        <w:rPr>
+          <w:b/>
+          <w:bCs/>
+        </w:rPr>
+        <w:t xml:space="preserve">Accept</w:t>
+      </w:r>
+      <w:r>
+        <w:t xml:space="preserve">: the documented cross-paradigm excess (+0.26 at TTC6) is reproduced by</w:t>
+      </w:r>
+      <w:r>
+        <w:t xml:space="preserve"> </w:t>
+      </w:r>
+      <w:r>
+        <w:t xml:space="preserve">the shifted model within 0.05 at the fixed-clip checkpoints.</w:t>
+      </w:r>
+    </w:p>
+    <w:bookmarkEnd w:id="15"/>
+    <w:bookmarkStart w:id="16" w:name="Xe9b12db9ccf940c2e98352feae798e2c271a525"/>
+    <w:p>
+      <w:pPr>
+        <w:pStyle w:val="Heading3"/>
+      </w:pPr>
+      <w:r>
+        <w:t xml:space="preserve">Cards B.1–B.3 — transfer-scenario field constructions</w:t>
+      </w:r>
+    </w:p>
+    <w:p>
+      <w:pPr>
+        <w:pStyle w:val="FirstParagraph"/>
+      </w:pPr>
+      <w:r>
+        <w:t xml:space="preserve">Template for each: a loader in</w:t>
+      </w:r>
+      <w:r>
+        <w:t xml:space="preserve"> </w:t>
+      </w:r>
+      <w:r>
+        <w:rPr>
+          <w:rStyle w:val="VerbatimChar"/>
+        </w:rPr>
+        <w:t xml:space="preserve">src/comfortzone/&lt;scenario&gt;.py</w:t>
+      </w:r>
+      <w:r>
+        <w:t xml:space="preserve"> </w:t>
+      </w:r>
+      <w:r>
+        <w:t xml:space="preserve">following</w:t>
+      </w:r>
+      <w:r>
+        <w:t xml:space="preserve"> </w:t>
+      </w:r>
+      <w:r>
+        <w:rPr>
+          <w:rStyle w:val="VerbatimChar"/>
+        </w:rPr>
+        <w:t xml:space="preserve">cutin.py</w:t>
+      </w:r>
+      <w:r>
+        <w:t xml:space="preserve">’s</w:t>
+      </w:r>
+      <w:r>
+        <w:t xml:space="preserve"> </w:t>
+      </w:r>
+      <w:r>
+        <w:t xml:space="preserve">structure (role assignment appropriate to the scenario —</w:t>
+      </w:r>
+      <w:r>
+        <w:t xml:space="preserve"> </w:t>
+      </w:r>
+      <w:r>
+        <w:rPr>
+          <w:b/>
+          <w:bCs/>
+        </w:rPr>
+        <w:t xml:space="preserve">by instructed vehicle, not</w:t>
+      </w:r>
+      <w:r>
+        <w:rPr>
+          <w:b/>
+          <w:bCs/>
+        </w:rPr>
+        <w:t xml:space="preserve"> </w:t>
+      </w:r>
+      <w:r>
+        <w:rPr>
+          <w:b/>
+          <w:bCs/>
+        </w:rPr>
+        <w:t xml:space="preserve">lateral span</w:t>
+      </w:r>
+      <w:r>
+        <w:t xml:space="preserve">), a field check script in</w:t>
+      </w:r>
+      <w:r>
+        <w:t xml:space="preserve"> </w:t>
+      </w:r>
+      <w:r>
+        <w:rPr>
+          <w:rStyle w:val="VerbatimChar"/>
+        </w:rPr>
+        <w:t xml:space="preserve">replication/czb/</w:t>
+      </w:r>
+      <w:r>
+        <w:t xml:space="preserve"> </w:t>
+      </w:r>
+      <w:r>
+        <w:t xml:space="preserve">producing a</w:t>
+      </w:r>
+      <w:r>
+        <w:t xml:space="preserve"> </w:t>
+      </w:r>
+      <w:r>
+        <w:t xml:space="preserve">per-criticality deficit figure, property tests, and the PS-versus-field correlation</w:t>
+      </w:r>
+      <w:r>
+        <w:t xml:space="preserve"> </w:t>
+      </w:r>
+      <w:r>
+        <w:t xml:space="preserve">(the</w:t>
+      </w:r>
+      <w:r>
+        <w:t xml:space="preserve"> </w:t>
+      </w:r>
+      <w:r>
+        <w:rPr>
+          <w:rStyle w:val="VerbatimChar"/>
+        </w:rPr>
+        <w:t xml:space="preserve">ps_vs_field.py</w:t>
+      </w:r>
+      <w:r>
+        <w:t xml:space="preserve"> </w:t>
+      </w:r>
+      <w:r>
+        <w:t xml:space="preserve">pattern) as the acceptance readout.</w:t>
+      </w:r>
+    </w:p>
+    <w:p>
+      <w:pPr>
+        <w:pStyle w:val="Compact"/>
+        <w:numPr>
+          <w:ilvl w:val="0"/>
+          <w:numId w:val="1009"/>
+        </w:numPr>
+      </w:pPr>
+      <w:r>
+        <w:rPr>
+          <w:b/>
+          <w:bCs/>
+        </w:rPr>
+        <w:t xml:space="preserve">B.1 cyclist overtake</w:t>
+      </w:r>
+      <w:r>
+        <w:t xml:space="preserve"> </w:t>
+      </w:r>
+      <w:r>
+        <w:t xml:space="preserve">(first): ego closes on a cyclist in lane; rear-end field</w:t>
+      </w:r>
+      <w:r>
+        <w:t xml:space="preserve"> </w:t>
+      </w:r>
+      <w:r>
+        <w:t xml:space="preserve">nearly unchanged; criticality = lateral clearance 0.5/1/1.5 m, so the lateral term</w:t>
+      </w:r>
+      <w:r>
+        <w:t xml:space="preserve"> </w:t>
+      </w:r>
+      <w:r>
+        <w:t xml:space="preserve">matters — use the actual clearance in</w:t>
+      </w:r>
+      <w:r>
+        <w:t xml:space="preserve"> </w:t>
+      </w:r>
+      <w:r>
+        <w:rPr>
+          <w:rStyle w:val="VerbatimChar"/>
+        </w:rPr>
+        <w:t xml:space="preserve">dy</w:t>
+      </w:r>
+      <w:r>
+        <w:t xml:space="preserve">, widths from the trace (cyclist ≈ 0.6 m).</w:t>
+      </w:r>
+      <w:r>
+        <w:t xml:space="preserve"> </w:t>
+      </w:r>
+      <w:r>
+        <w:t xml:space="preserve">Accept: deficit ordered by clearance at C2–C5; cell-level PS Spearman ρ reported.</w:t>
+      </w:r>
+    </w:p>
+    <w:p>
+      <w:pPr>
+        <w:pStyle w:val="Compact"/>
+        <w:numPr>
+          <w:ilvl w:val="0"/>
+          <w:numId w:val="1009"/>
+        </w:numPr>
+      </w:pPr>
+      <w:r>
+        <w:rPr>
+          <w:b/>
+          <w:bCs/>
+        </w:rPr>
         <w:t xml:space="preserve">B.2 truck overtake / truck lateral</w:t>
       </w:r>
       <w:r>
@@ -1569,7 +2039,7 @@
         <w:pStyle w:val="Compact"/>
         <w:numPr>
           <w:ilvl w:val="0"/>
-          <w:numId w:val="1007"/>
+          <w:numId w:val="1009"/>
         </w:numPr>
       </w:pPr>
       <w:r>
@@ -1632,111 +2102,6 @@
       </w:r>
       <w:r>
         <w:t xml:space="preserve">.</w:t>
-      </w:r>
-    </w:p>
-    <w:p>
-      <w:pPr>
-        <w:pStyle w:val="Compact"/>
-        <w:numPr>
-          <w:ilvl w:val="0"/>
-          <w:numId w:val="1007"/>
-        </w:numPr>
-      </w:pPr>
-      <w:r>
-        <w:rPr>
-          <w:b/>
-          <w:bCs/>
-        </w:rPr>
-        <w:t xml:space="preserve">Stop for all three if</w:t>
-      </w:r>
-      <w:r>
-        <w:t xml:space="preserve">: a trace family’s geometry does not fit the template</w:t>
-      </w:r>
-      <w:r>
-        <w:t xml:space="preserve"> </w:t>
-      </w:r>
-      <w:r>
-        <w:t xml:space="preserve">(e.g. missing vehicle, broken dimensions beyond the documented truck case).</w:t>
-      </w:r>
-    </w:p>
-    <w:bookmarkEnd w:id="15"/>
-    <w:bookmarkStart w:id="16" w:name="X2e740bdde0311d32c80d142a3abf565c10676ee"/>
-    <w:p>
-      <w:pPr>
-        <w:pStyle w:val="Heading3"/>
-      </w:pPr>
-      <w:r>
-        <w:t xml:space="preserve">Card B.4 — the transfer test (review gate; do not run before A.3 and B.1–B.3)</w:t>
-      </w:r>
-    </w:p>
-    <w:p>
-      <w:pPr>
-        <w:pStyle w:val="Compact"/>
-        <w:numPr>
-          <w:ilvl w:val="0"/>
-          <w:numId w:val="1008"/>
-        </w:numPr>
-      </w:pPr>
-      <w:r>
-        <w:t xml:space="preserve">Fit on cut-in only (A.2/A.3 configuration frozen); predict each transfer scenario’s</w:t>
-      </w:r>
-      <w:r>
-        <w:t xml:space="preserve"> </w:t>
-      </w:r>
-      <w:r>
-        <w:t xml:space="preserve">response surface with no refit. Primary: no per-scenario shift. Secondary: one</w:t>
-      </w:r>
-      <w:r>
-        <w:t xml:space="preserve"> </w:t>
-      </w:r>
-      <w:r>
-        <w:t xml:space="preserve">instruction shift per scenario. Comparators on identical folds: per-scenario 2D</w:t>
-      </w:r>
-      <w:r>
-        <w:t xml:space="preserve"> </w:t>
-      </w:r>
-      <w:r>
-        <w:t xml:space="preserve">state rules (1/TTC-analogue + the scenario’s own second observable), and — once</w:t>
-      </w:r>
-      <w:r>
-        <w:t xml:space="preserve"> </w:t>
-      </w:r>
-      <w:r>
-        <w:t xml:space="preserve">specified with Jonas — the elliptical joint on the same observables.</w:t>
-      </w:r>
-    </w:p>
-    <w:p>
-      <w:pPr>
-        <w:pStyle w:val="Compact"/>
-        <w:numPr>
-          <w:ilvl w:val="0"/>
-          <w:numId w:val="1008"/>
-        </w:numPr>
-      </w:pPr>
-      <w:r>
-        <w:t xml:space="preserve">Output: one table, per scenario × model: held-out corr and RMSE against (a) chance</w:t>
-      </w:r>
-      <w:r>
-        <w:t xml:space="preserve"> </w:t>
-      </w:r>
-      <w:r>
-        <w:t xml:space="preserve">and (b) the per-scenario-refit ceiling. No verdict prose from the executing</w:t>
-      </w:r>
-      <w:r>
-        <w:t xml:space="preserve"> </w:t>
-      </w:r>
-      <w:r>
-        <w:t xml:space="preserve">session; the verdict is a review task.</w:t>
-      </w:r>
-    </w:p>
-    <w:bookmarkEnd w:id="16"/>
-    <w:bookmarkStart w:id="17" w:name="card-c-percentile-sensitivity"/>
-    <w:p>
-      <w:pPr>
-        <w:pStyle w:val="Heading3"/>
-      </w:pPr>
-      <w:r>
-        <w:t xml:space="preserve">Card C — percentile sensitivity</w:t>
       </w:r>
     </w:p>
     <w:p>
@@ -1749,43 +2114,29 @@
       </w:pPr>
       <w:r>
         <w:rPr>
-          <w:rStyle w:val="VerbatimChar"/>
-        </w:rPr>
-        <w:t xml:space="preserve">replication/czb/percentile_sensitivity.py</w:t>
-      </w:r>
-      <w:r>
-        <w:t xml:space="preserve"> </w:t>
-      </w:r>
-      <w:r>
-        <w:t xml:space="preserve">from A.2’s population distribution:</w:t>
-      </w:r>
-      <w:r>
-        <w:t xml:space="preserve"> </w:t>
-      </w:r>
-      <w:r>
-        <w:t xml:space="preserve">implied trigger onset per stimulus for percentiles 50–95 (step 5) × a_allowed on</w:t>
-      </w:r>
-      <w:r>
-        <w:t xml:space="preserve"> </w:t>
-      </w:r>
-      <w:r>
-        <w:t xml:space="preserve">the fitted comfort–dread range; report d(onset)/d(5 percentile points) in seconds</w:t>
-      </w:r>
-      <w:r>
-        <w:t xml:space="preserve"> </w:t>
-      </w:r>
-      <w:r>
-        <w:t xml:space="preserve">against the percentile’s own CI width. One figure, one table.</w:t>
-      </w:r>
-    </w:p>
-    <w:bookmarkEnd w:id="17"/>
-    <w:bookmarkStart w:id="18" w:name="Xab5693df3d10b816b24afc842194bc9dbb4fe22"/>
+          <w:b/>
+          <w:bCs/>
+        </w:rPr>
+        <w:t xml:space="preserve">Stop for all three if</w:t>
+      </w:r>
+      <w:r>
+        <w:t xml:space="preserve">: a trace family’s geometry does not fit the template</w:t>
+      </w:r>
+      <w:r>
+        <w:t xml:space="preserve"> </w:t>
+      </w:r>
+      <w:r>
+        <w:t xml:space="preserve">(e.g. missing vehicle, broken dimensions beyond the documented truck case).</w:t>
+      </w:r>
+    </w:p>
+    <w:bookmarkEnd w:id="16"/>
+    <w:bookmarkStart w:id="17" w:name="X2e740bdde0311d32c80d142a3abf565c10676ee"/>
     <w:p>
       <w:pPr>
         <w:pStyle w:val="Heading3"/>
       </w:pPr>
       <w:r>
-        <w:t xml:space="preserve">Card E.1 — closed-form versus sampled lane-entry expectation</w:t>
+        <w:t xml:space="preserve">Card B.4 — the transfer test (review gate; do not run before A.3 and B.1–B.3)</w:t>
       </w:r>
     </w:p>
     <w:p>
@@ -1797,6 +2148,125 @@
         </w:numPr>
       </w:pPr>
       <w:r>
+        <w:t xml:space="preserve">Fit on cut-in only (A.2/A.3 configuration frozen); predict each transfer scenario’s</w:t>
+      </w:r>
+      <w:r>
+        <w:t xml:space="preserve"> </w:t>
+      </w:r>
+      <w:r>
+        <w:t xml:space="preserve">response surface with no refit. Primary: no per-scenario shift. Secondary: one</w:t>
+      </w:r>
+      <w:r>
+        <w:t xml:space="preserve"> </w:t>
+      </w:r>
+      <w:r>
+        <w:t xml:space="preserve">instruction shift per scenario. Comparators on identical folds: per-scenario 2D</w:t>
+      </w:r>
+      <w:r>
+        <w:t xml:space="preserve"> </w:t>
+      </w:r>
+      <w:r>
+        <w:t xml:space="preserve">state rules (1/TTC-analogue + the scenario’s own second observable), and — once</w:t>
+      </w:r>
+      <w:r>
+        <w:t xml:space="preserve"> </w:t>
+      </w:r>
+      <w:r>
+        <w:t xml:space="preserve">specified with Jonas — the elliptical joint on the same observables.</w:t>
+      </w:r>
+    </w:p>
+    <w:p>
+      <w:pPr>
+        <w:pStyle w:val="Compact"/>
+        <w:numPr>
+          <w:ilvl w:val="0"/>
+          <w:numId w:val="1010"/>
+        </w:numPr>
+      </w:pPr>
+      <w:r>
+        <w:t xml:space="preserve">Output: one table, per scenario × model: held-out corr and RMSE against (a) chance</w:t>
+      </w:r>
+      <w:r>
+        <w:t xml:space="preserve"> </w:t>
+      </w:r>
+      <w:r>
+        <w:t xml:space="preserve">and (b) the per-scenario-refit ceiling. No verdict prose from the executing</w:t>
+      </w:r>
+      <w:r>
+        <w:t xml:space="preserve"> </w:t>
+      </w:r>
+      <w:r>
+        <w:t xml:space="preserve">session; the verdict is a review task.</w:t>
+      </w:r>
+    </w:p>
+    <w:bookmarkEnd w:id="17"/>
+    <w:bookmarkStart w:id="18" w:name="card-c-percentile-sensitivity"/>
+    <w:p>
+      <w:pPr>
+        <w:pStyle w:val="Heading3"/>
+      </w:pPr>
+      <w:r>
+        <w:t xml:space="preserve">Card C — percentile sensitivity</w:t>
+      </w:r>
+    </w:p>
+    <w:p>
+      <w:pPr>
+        <w:pStyle w:val="Compact"/>
+        <w:numPr>
+          <w:ilvl w:val="0"/>
+          <w:numId w:val="1011"/>
+        </w:numPr>
+      </w:pPr>
+      <w:r>
+        <w:rPr>
+          <w:rStyle w:val="VerbatimChar"/>
+        </w:rPr>
+        <w:t xml:space="preserve">replication/czb/percentile_sensitivity.py</w:t>
+      </w:r>
+      <w:r>
+        <w:t xml:space="preserve"> </w:t>
+      </w:r>
+      <w:r>
+        <w:t xml:space="preserve">from A.2’s population distribution:</w:t>
+      </w:r>
+      <w:r>
+        <w:t xml:space="preserve"> </w:t>
+      </w:r>
+      <w:r>
+        <w:t xml:space="preserve">implied trigger onset per stimulus for percentiles 50–95 (step 5) × a_allowed on</w:t>
+      </w:r>
+      <w:r>
+        <w:t xml:space="preserve"> </w:t>
+      </w:r>
+      <w:r>
+        <w:t xml:space="preserve">the fitted comfort–dread range; report d(onset)/d(5 percentile points) in seconds</w:t>
+      </w:r>
+      <w:r>
+        <w:t xml:space="preserve"> </w:t>
+      </w:r>
+      <w:r>
+        <w:t xml:space="preserve">against the percentile’s own CI width. One figure, one table.</w:t>
+      </w:r>
+    </w:p>
+    <w:bookmarkEnd w:id="18"/>
+    <w:bookmarkStart w:id="19" w:name="Xab5693df3d10b816b24afc842194bc9dbb4fe22"/>
+    <w:p>
+      <w:pPr>
+        <w:pStyle w:val="Heading3"/>
+      </w:pPr>
+      <w:r>
+        <w:t xml:space="preserve">Card E.1 — closed-form versus sampled lane-entry expectation</w:t>
+      </w:r>
+    </w:p>
+    <w:p>
+      <w:pPr>
+        <w:pStyle w:val="Compact"/>
+        <w:numPr>
+          <w:ilvl w:val="0"/>
+          <w:numId w:val="1012"/>
+        </w:numPr>
+      </w:pPr>
+      <w:r>
         <w:t xml:space="preserve">Monte Carlo the released binary gates under steering noise (heading random walk,</w:t>
       </w:r>
       <w:r>
@@ -1848,8 +2318,8 @@
         <w:t xml:space="preserve">validates the closed form, larger structured disagreement goes to review.</w:t>
       </w:r>
     </w:p>
-    <w:bookmarkEnd w:id="18"/>
-    <w:bookmarkStart w:id="19" w:name="cards-e.2-e.3-and-d"/>
+    <w:bookmarkEnd w:id="19"/>
+    <w:bookmarkStart w:id="20" w:name="cards-e.2-e.3-and-d"/>
     <w:p>
       <w:pPr>
         <w:pStyle w:val="Heading3"/>
@@ -1878,9 +2348,9 @@
         <w:t xml:space="preserve">runner’s intervention injection. These get cards after their design notes exist.</w:t>
       </w:r>
     </w:p>
-    <w:bookmarkEnd w:id="19"/>
     <w:bookmarkEnd w:id="20"/>
-    <w:bookmarkStart w:id="21" w:name="suggested-session-pattern"/>
+    <w:bookmarkEnd w:id="21"/>
+    <w:bookmarkStart w:id="22" w:name="suggested-session-pattern"/>
     <w:p>
       <w:pPr>
         <w:pStyle w:val="Heading2"/>
@@ -1972,8 +2442,8 @@
         <w:t xml:space="preserve">and B.4 at minimum.</w:t>
       </w:r>
     </w:p>
-    <w:bookmarkEnd w:id="21"/>
     <w:bookmarkEnd w:id="22"/>
+    <w:bookmarkEnd w:id="23"/>
     <w:sectPr>
       <w:footnotePr>
         <w:numRestart w:val="eachSect"/>
@@ -2312,7 +2782,34 @@
     <w:abstractNumId w:val="991"/>
   </w:num>
   <w:num w:numId="1004">
-    <w:abstractNumId w:val="991"/>
+    <w:abstractNumId w:val="99411"/>
+    <w:lvlOverride w:ilvl="0">
+      <w:startOverride w:val="1"/>
+    </w:lvlOverride>
+    <w:lvlOverride w:ilvl="1">
+      <w:startOverride w:val="1"/>
+    </w:lvlOverride>
+    <w:lvlOverride w:ilvl="2">
+      <w:startOverride w:val="1"/>
+    </w:lvlOverride>
+    <w:lvlOverride w:ilvl="3">
+      <w:startOverride w:val="1"/>
+    </w:lvlOverride>
+    <w:lvlOverride w:ilvl="4">
+      <w:startOverride w:val="1"/>
+    </w:lvlOverride>
+    <w:lvlOverride w:ilvl="5">
+      <w:startOverride w:val="1"/>
+    </w:lvlOverride>
+    <w:lvlOverride w:ilvl="6">
+      <w:startOverride w:val="1"/>
+    </w:lvlOverride>
+    <w:lvlOverride w:ilvl="7">
+      <w:startOverride w:val="1"/>
+    </w:lvlOverride>
+    <w:lvlOverride w:ilvl="8">
+      <w:startOverride w:val="1"/>
+    </w:lvlOverride>
   </w:num>
   <w:num w:numId="1005">
     <w:abstractNumId w:val="991"/>
@@ -2330,6 +2827,12 @@
     <w:abstractNumId w:val="991"/>
   </w:num>
   <w:num w:numId="1010">
+    <w:abstractNumId w:val="991"/>
+  </w:num>
+  <w:num w:numId="1011">
+    <w:abstractNumId w:val="991"/>
+  </w:num>
+  <w:num w:numId="1012">
     <w:abstractNumId w:val="991"/>
   </w:num>
 </w:numbering>

</xml_diff>